<commit_message>
docs(repo): dejar el proyecto a nombre de un solo integrante
Retira al segundo integrante de los encabezados de las cuatro fases, de
los ADR y de las guias del repositorio, en las versiones Markdown y en
los documentos de Word.

Dos consecuencias no son cosmeticas y quedan escritas:

La revision por pares desaparecio. CONTRIBUTING lo dice sin adornos: se
perdio un control real. El pull request se mantiene porque obliga a leer
el diff completo y deja la revision en el historial, y lo que compensa en
parte son las pruebas automatizadas y las restricciones del esquema, que
no dependen de que alguien las recuerde.

La capacidad por sprint se reduce a la mitad. RE-06 pasa a declarar un
solo desarrollador y velocidad.md abre con la replanificacion: los 126
puntos del MVP no caben en cuatro sprints, y la decision entre recortar
alcance o ampliar el calendario le corresponde a la coordinacion
academica.
</commit_message>
<xml_diff>
--- a/fase1-epicas-historias/Fase1-Epicas-e-Historias-SGA-APA7.docx
+++ b/fase1-epicas-historias/Fase1-Epicas-e-Historias-SGA-APA7.docx
@@ -24,14 +24,6 @@
       </w:pPr>
       <w:r>
         <w:t>Jannier Johan Otavo</w:t>
-      </w:r>
-    </w:p>
-    <w:p>
-      <w:pPr>
-        <w:jc w:val="center"/>
-      </w:pPr>
-      <w:r>
-        <w:t>Sergio David Vargas</w:t>
       </w:r>
     </w:p>
     <w:p>

</xml_diff>